<commit_message>
docs(capstone): point the demonstration link at the video that exists
The link recorded on 20 August was a different upload. It appeared in eight
places across five documents, including report section 4.4 and the appendix, so
an examiner following it would have reached nothing.

Replaced with https://youtu.be/rOvrgbP5F4o throughout, without the share
parameter, and all three documents rebuilt.

The signed PDF on the Desktop still carries the old link and needs re-exporting
from this build and re-signing.

Area: docs (Bhargav)
</commit_message>
<xml_diff>
--- a/docs/capstone/Hive-Summary.docx
+++ b/docs/capstone/Hive-Summary.docx
@@ -173,7 +173,7 @@
               <w:pStyle w:val="Compact"/>
             </w:pPr>
             <w:r>
-              <w:t xml:space="preserve">https://youtu.be/_kvid-1KXxA</w:t>
+              <w:t xml:space="preserve">https://youtu.be/rOvrgbP5F4o</w:t>
             </w:r>
           </w:p>
         </w:tc>
@@ -833,7 +833,7 @@
         </w:numPr>
       </w:pPr>
       <w:r>
-        <w:t xml:space="preserve">Demonstration video: https://youtu.be/_kvid-1KXxA</w:t>
+        <w:t xml:space="preserve">Demonstration video: https://youtu.be/rOvrgbP5F4o</w:t>
       </w:r>
     </w:p>
     <w:bookmarkEnd w:id="545"/>

</xml_diff>